<commit_message>
fix: restore thousands separator formatting in fee input badges
</commit_message>
<xml_diff>
--- a/template/Tassure_Proposal_Template.docx
+++ b/template/Tassure_Proposal_Template.docx
@@ -2538,6 +2538,14 @@
           <w:lang w:eastAsia="zh-CN"/>
         </w:rPr>
         <w:t>）的现行规定，每年召开</w:t>
+      </w:r>
+      <w:r>
+        <w:rPr>
+          <w:rFonts w:ascii="Microsoft YaHei" w:eastAsia="Microsoft YaHei" w:hAnsi="Microsoft YaHei" w:cs="Microsoft YaHei" w:hint="eastAsia"/>
+          <w:sz w:val="20"/>
+          <w:szCs w:val="20"/>
+          <w:lang w:eastAsia="zh-CN"/>
+        </w:rPr>
         <w:lastRenderedPageBreak/>
         <w:t>年度股东大会（</w:t>
       </w:r>
@@ -5183,6 +5191,8 @@
       </w:pPr>
       <w:r>
         <w:t xml:space="preserve">Letter of Consent ("LOC") for Secondary Directorship refers to the formal authorization granted by the Ministry of Manpower ("MOM") allowing an Employment Pass ("EP") holder to be appointed as a director in a related or investment-linked entity. This service ensures that the appointment </w:t>
+      </w:r>
+      <w:r>
         <w:lastRenderedPageBreak/>
         <w:t>complies with the Employment of Foreign Manpower Act and maintains the integrity of the applicant's primary work pass status</w:t>
       </w:r>
@@ -5707,17 +5717,51 @@
                 <w:sz w:val="20"/>
                 <w:szCs w:val="20"/>
               </w:rPr>
-              <w:t xml:space="preserve">Corporate Secretarial Services </w:t>
-            </w:r>
-          </w:p>
-          <w:p>
-            <w:pPr>
-              <w:rPr>
+              <w:t>Corporate Secretarial Services</w:t>
+            </w:r>
+            <w:r>
+              <w:rPr>
+                <w:rFonts w:eastAsia="Arial"/>
                 <w:sz w:val="20"/>
                 <w:szCs w:val="20"/>
-                <w:lang w:eastAsia="zh-CN"/>
-              </w:rPr>
-            </w:pPr>
+              </w:rPr>
+              <w:t xml:space="preserve"> </w:t>
+            </w:r>
+            <w:r>
+              <w:rPr>
+                <w:rFonts w:eastAsiaTheme="minorEastAsia" w:hint="eastAsia"/>
+                <w:sz w:val="20"/>
+                <w:szCs w:val="20"/>
+                <w:lang w:eastAsia="zh-CN"/>
+              </w:rPr>
+              <w:t xml:space="preserve">- </w:t>
+            </w:r>
+            <w:r>
+              <w:rPr>
+                <w:rFonts w:eastAsia="Arial"/>
+                <w:sz w:val="20"/>
+                <w:szCs w:val="20"/>
+              </w:rPr>
+              <w:t>Yearly</w:t>
+            </w:r>
+            <w:r>
+              <w:rPr>
+                <w:rFonts w:eastAsia="Arial"/>
+                <w:sz w:val="20"/>
+                <w:szCs w:val="20"/>
+              </w:rPr>
+              <w:t xml:space="preserve"> </w:t>
+            </w:r>
+          </w:p>
+          <w:p>
+            <w:pPr>
+              <w:rPr>
+                <w:sz w:val="20"/>
+                <w:szCs w:val="20"/>
+                <w:lang w:eastAsia="zh-CN"/>
+              </w:rPr>
+            </w:pPr>
+            <w:proofErr w:type="spellStart"/>
             <w:r>
               <w:rPr>
                 <w:rFonts w:ascii="Microsoft YaHei" w:eastAsia="Microsoft YaHei" w:hAnsi="Microsoft YaHei"/>
@@ -5725,6 +5769,16 @@
                 <w:szCs w:val="18"/>
               </w:rPr>
               <w:t>公司法定秘书服务</w:t>
+            </w:r>
+            <w:proofErr w:type="spellEnd"/>
+            <w:r>
+              <w:rPr>
+                <w:rFonts w:ascii="Microsoft YaHei" w:eastAsia="Microsoft YaHei" w:hAnsi="Microsoft YaHei"/>
+                <w:sz w:val="18"/>
+                <w:szCs w:val="18"/>
+                <w:lang w:eastAsia="zh-CN"/>
+              </w:rPr>
+              <w:t>（年费）</w:t>
             </w:r>
           </w:p>
         </w:tc>
@@ -5927,7 +5981,40 @@
                 <w:sz w:val="20"/>
                 <w:szCs w:val="20"/>
               </w:rPr>
-              <w:t xml:space="preserve">Registered Office and Mailing Address Services </w:t>
+              <w:t>Registered Office and Mailing Address Services</w:t>
+            </w:r>
+            <w:r>
+              <w:rPr>
+                <w:rFonts w:eastAsia="Arial"/>
+                <w:sz w:val="20"/>
+                <w:szCs w:val="20"/>
+              </w:rPr>
+              <w:t xml:space="preserve"> </w:t>
+            </w:r>
+            <w:r>
+              <w:rPr>
+                <w:rFonts w:eastAsiaTheme="minorEastAsia" w:hint="eastAsia"/>
+                <w:sz w:val="20"/>
+                <w:szCs w:val="20"/>
+                <w:lang w:eastAsia="zh-CN"/>
+              </w:rPr>
+              <w:t xml:space="preserve">- </w:t>
+            </w:r>
+            <w:r>
+              <w:rPr>
+                <w:rFonts w:eastAsia="Arial"/>
+                <w:sz w:val="20"/>
+                <w:szCs w:val="20"/>
+              </w:rPr>
+              <w:t>Yearly</w:t>
+            </w:r>
+            <w:r>
+              <w:rPr>
+                <w:rFonts w:eastAsia="Arial"/>
+                <w:sz w:val="20"/>
+                <w:szCs w:val="20"/>
+              </w:rPr>
+              <w:t xml:space="preserve"> </w:t>
             </w:r>
           </w:p>
           <w:p>
@@ -5947,6 +6034,15 @@
                 <w:lang w:eastAsia="zh-CN"/>
               </w:rPr>
               <w:t>公司注册地址及收信服务</w:t>
+            </w:r>
+            <w:r>
+              <w:rPr>
+                <w:rFonts w:ascii="Microsoft YaHei" w:eastAsia="Microsoft YaHei" w:hAnsi="Microsoft YaHei"/>
+                <w:sz w:val="18"/>
+                <w:szCs w:val="18"/>
+                <w:lang w:eastAsia="zh-CN"/>
+              </w:rPr>
+              <w:t>（年费）</w:t>
             </w:r>
           </w:p>
         </w:tc>
@@ -6595,6 +6691,13 @@
                 <w:szCs w:val="20"/>
               </w:rPr>
               <w:t>F.O.C.</w:t>
+            </w:r>
+            <w:r>
+              <w:rPr>
+                <w:rFonts w:eastAsia="Arial"/>
+                <w:sz w:val="20"/>
+                <w:szCs w:val="20"/>
+              </w:rPr>
               <w:br/>
               <w:t xml:space="preserve">Included in package </w:t>
             </w:r>
@@ -6602,7 +6705,26 @@
           <w:p>
             <w:pPr>
               <w:rPr>
-                <w:rFonts w:eastAsiaTheme="minorEastAsia"/>
+                <w:rFonts w:ascii="Microsoft YaHei" w:eastAsia="Microsoft YaHei" w:hAnsi="Microsoft YaHei"/>
+                <w:sz w:val="18"/>
+                <w:szCs w:val="18"/>
+                <w:lang w:val="en-SG" w:eastAsia="zh-CN"/>
+              </w:rPr>
+            </w:pPr>
+            <w:r>
+              <w:rPr>
+                <w:rFonts w:ascii="Microsoft YaHei" w:eastAsia="Microsoft YaHei" w:hAnsi="Microsoft YaHei"/>
+                <w:sz w:val="18"/>
+                <w:szCs w:val="18"/>
+                <w:lang w:val="en-SG" w:eastAsia="zh-CN"/>
+              </w:rPr>
+              <w:t>不另收费</w:t>
+            </w:r>
+          </w:p>
+          <w:p>
+            <w:pPr>
+              <w:rPr>
+                <w:rFonts w:eastAsiaTheme="minorEastAsia" w:hint="eastAsia"/>
                 <w:sz w:val="20"/>
                 <w:szCs w:val="20"/>
                 <w:lang w:eastAsia="zh-CN"/>
@@ -6610,12 +6732,21 @@
             </w:pPr>
             <w:r>
               <w:rPr>
+                <w:rFonts w:ascii="Microsoft YaHei" w:eastAsia="Microsoft YaHei" w:hAnsi="Microsoft YaHei" w:hint="eastAsia"/>
+                <w:sz w:val="18"/>
+                <w:szCs w:val="18"/>
+                <w:lang w:val="en-SG" w:eastAsia="zh-CN"/>
+              </w:rPr>
+              <w:t>(</w:t>
+            </w:r>
+            <w:r>
+              <w:rPr>
                 <w:rFonts w:ascii="Microsoft YaHei" w:eastAsia="Microsoft YaHei" w:hAnsi="Microsoft YaHei"/>
                 <w:sz w:val="18"/>
                 <w:szCs w:val="18"/>
                 <w:lang w:val="en-SG" w:eastAsia="zh-CN"/>
               </w:rPr>
-              <w:t>不另收费（含</w:t>
+              <w:t>含</w:t>
             </w:r>
             <w:r>
               <w:rPr>
@@ -6633,7 +6764,16 @@
                 <w:szCs w:val="18"/>
                 <w:lang w:val="en-SG" w:eastAsia="zh-CN"/>
               </w:rPr>
-              <w:t>内）</w:t>
+              <w:t>内</w:t>
+            </w:r>
+            <w:r>
+              <w:rPr>
+                <w:rFonts w:ascii="Microsoft YaHei" w:eastAsia="Microsoft YaHei" w:hAnsi="Microsoft YaHei" w:hint="eastAsia"/>
+                <w:sz w:val="18"/>
+                <w:szCs w:val="18"/>
+                <w:lang w:val="en-SG" w:eastAsia="zh-CN"/>
+              </w:rPr>
+              <w:t>)</w:t>
             </w:r>
           </w:p>
         </w:tc>
@@ -6817,6 +6957,13 @@
                 <w:szCs w:val="20"/>
               </w:rPr>
               <w:t xml:space="preserve"> DPO Appointment &amp; Policy Documentation</w:t>
+            </w:r>
+            <w:r>
+              <w:rPr>
+                <w:rFonts w:eastAsia="Arial"/>
+                <w:sz w:val="20"/>
+                <w:szCs w:val="20"/>
+              </w:rPr>
               <w:br/>
             </w:r>
             <w:r>
@@ -7138,7 +7285,29 @@
                 <w:szCs w:val="18"/>
                 <w:lang w:eastAsia="zh-CN"/>
               </w:rPr>
-              <w:t>ncluding secure deposit含押金</w:t>
+              <w:t>ncluding secure deposit</w:t>
+            </w:r>
+            <w:r>
+              <w:rPr>
+                <w:rFonts w:ascii="Microsoft YaHei" w:eastAsia="Microsoft YaHei" w:hAnsi="Microsoft YaHei" w:hint="eastAsia"/>
+                <w:b/>
+                <w:bCs/>
+                <w:sz w:val="18"/>
+                <w:szCs w:val="18"/>
+                <w:lang w:eastAsia="zh-CN"/>
+              </w:rPr>
+              <w:t xml:space="preserve"> </w:t>
+            </w:r>
+            <w:r>
+              <w:rPr>
+                <w:rFonts w:ascii="Microsoft YaHei" w:eastAsia="Microsoft YaHei" w:hAnsi="Microsoft YaHei" w:hint="eastAsia"/>
+                <w:b/>
+                <w:bCs/>
+                <w:sz w:val="18"/>
+                <w:szCs w:val="18"/>
+                <w:lang w:eastAsia="zh-CN"/>
+              </w:rPr>
+              <w:t>含押金</w:t>
             </w:r>
             <w:r>
               <w:rPr>
@@ -7532,46 +7701,28 @@
             </w:r>
             <w:r>
               <w:rPr>
+                <w:rFonts w:eastAsia="Arial"/>
+                <w:sz w:val="20"/>
+                <w:szCs w:val="20"/>
+              </w:rPr>
+              <w:t xml:space="preserve"> </w:t>
+            </w:r>
+            <w:r>
+              <w:rPr>
                 <w:rFonts w:eastAsiaTheme="minorEastAsia" w:hint="eastAsia"/>
                 <w:sz w:val="20"/>
                 <w:szCs w:val="20"/>
                 <w:lang w:eastAsia="zh-CN"/>
               </w:rPr>
-              <w:t xml:space="preserve"> </w:t>
-            </w:r>
-            <w:r>
-              <w:rPr>
-                <w:rFonts w:hint="eastAsia"/>
+              <w:t xml:space="preserve">- </w:t>
+            </w:r>
+            <w:r>
+              <w:rPr>
+                <w:rFonts w:eastAsia="Arial"/>
                 <w:sz w:val="20"/>
                 <w:szCs w:val="20"/>
               </w:rPr>
-              <w:t>-</w:t>
-            </w:r>
-            <w:r>
-              <w:rPr>
-                <w:rFonts w:eastAsiaTheme="minorEastAsia" w:hint="eastAsia"/>
-                <w:sz w:val="20"/>
-                <w:szCs w:val="20"/>
-                <w:lang w:eastAsia="zh-CN"/>
-              </w:rPr>
-              <w:t xml:space="preserve"> </w:t>
-            </w:r>
-            <w:r>
-              <w:rPr>
-                <w:rFonts w:hint="eastAsia"/>
-                <w:sz w:val="20"/>
-                <w:szCs w:val="20"/>
-              </w:rPr>
-              <w:t>yearly</w:t>
-            </w:r>
-            <w:r>
-              <w:rPr>
-                <w:rFonts w:eastAsiaTheme="minorEastAsia" w:hint="eastAsia"/>
-                <w:sz w:val="20"/>
-                <w:szCs w:val="20"/>
-                <w:lang w:eastAsia="zh-CN"/>
-              </w:rPr>
-              <w:t xml:space="preserve"> </w:t>
+              <w:t>Yearly</w:t>
             </w:r>
           </w:p>
           <w:p>
@@ -7778,22 +7929,32 @@
                 <w:sz w:val="20"/>
                 <w:szCs w:val="20"/>
               </w:rPr>
-              <w:t xml:space="preserve">Secretarial Services – </w:t>
-            </w:r>
-            <w:r>
-              <w:rPr>
-                <w:rFonts w:hint="eastAsia"/>
+              <w:t>Secretarial Services</w:t>
+            </w:r>
+            <w:r>
+              <w:rPr>
+                <w:rFonts w:eastAsia="Arial"/>
                 <w:sz w:val="20"/>
                 <w:szCs w:val="20"/>
               </w:rPr>
-              <w:t>y</w:t>
-            </w:r>
-            <w:r>
-              <w:rPr>
+              <w:t xml:space="preserve"> </w:t>
+            </w:r>
+            <w:r>
+              <w:rPr>
+                <w:rFonts w:eastAsiaTheme="minorEastAsia" w:hint="eastAsia"/>
                 <w:sz w:val="20"/>
                 <w:szCs w:val="20"/>
-              </w:rPr>
-              <w:t xml:space="preserve">early </w:t>
+                <w:lang w:eastAsia="zh-CN"/>
+              </w:rPr>
+              <w:t xml:space="preserve">- </w:t>
+            </w:r>
+            <w:r>
+              <w:rPr>
+                <w:rFonts w:eastAsia="Arial"/>
+                <w:sz w:val="20"/>
+                <w:szCs w:val="20"/>
+              </w:rPr>
+              <w:t>Yearly</w:t>
             </w:r>
           </w:p>
           <w:p>
@@ -7937,22 +8098,32 @@
                 <w:sz w:val="20"/>
                 <w:szCs w:val="20"/>
               </w:rPr>
-              <w:t xml:space="preserve">mailing Address - </w:t>
-            </w:r>
-            <w:r>
-              <w:rPr>
-                <w:rFonts w:hint="eastAsia"/>
+              <w:t>mailing Address</w:t>
+            </w:r>
+            <w:r>
+              <w:rPr>
+                <w:rFonts w:eastAsia="Arial"/>
                 <w:sz w:val="20"/>
                 <w:szCs w:val="20"/>
               </w:rPr>
-              <w:t>y</w:t>
-            </w:r>
-            <w:r>
-              <w:rPr>
+              <w:t xml:space="preserve"> </w:t>
+            </w:r>
+            <w:r>
+              <w:rPr>
+                <w:rFonts w:eastAsiaTheme="minorEastAsia" w:hint="eastAsia"/>
                 <w:sz w:val="20"/>
                 <w:szCs w:val="20"/>
-              </w:rPr>
-              <w:t>early</w:t>
+                <w:lang w:eastAsia="zh-CN"/>
+              </w:rPr>
+              <w:t xml:space="preserve">- </w:t>
+            </w:r>
+            <w:r>
+              <w:rPr>
+                <w:rFonts w:eastAsia="Arial"/>
+                <w:sz w:val="20"/>
+                <w:szCs w:val="20"/>
+              </w:rPr>
+              <w:t>Yearly</w:t>
             </w:r>
           </w:p>
           <w:p>
@@ -9041,7 +9212,25 @@
                 <w:bCs/>
                 <w:lang w:eastAsia="zh-CN"/>
               </w:rPr>
-              <w:t xml:space="preserve">/year 每年 </w:t>
+              <w:t xml:space="preserve">/year </w:t>
+            </w:r>
+            <w:r>
+              <w:rPr>
+                <w:rFonts w:eastAsiaTheme="minorEastAsia" w:hint="eastAsia"/>
+                <w:b/>
+                <w:bCs/>
+                <w:lang w:eastAsia="zh-CN"/>
+              </w:rPr>
+              <w:t>每年</w:t>
+            </w:r>
+            <w:r>
+              <w:rPr>
+                <w:rFonts w:eastAsiaTheme="minorEastAsia" w:hint="eastAsia"/>
+                <w:b/>
+                <w:bCs/>
+                <w:lang w:eastAsia="zh-CN"/>
+              </w:rPr>
+              <w:t xml:space="preserve"> </w:t>
             </w:r>
           </w:p>
         </w:tc>
@@ -9646,7 +9835,7 @@
             <w:pPr>
               <w:jc w:val="center"/>
               <w:rPr>
-                <w:rFonts w:eastAsiaTheme="minorEastAsia" w:hint="eastAsia"/>
+                <w:rFonts w:eastAsiaTheme="minorEastAsia"/>
                 <w:sz w:val="20"/>
                 <w:szCs w:val="20"/>
                 <w:lang w:eastAsia="zh-CN"/>
@@ -9677,20 +9866,28 @@
           <w:p>
             <w:pPr>
               <w:rPr>
-                <w:rFonts w:ascii="Microsoft YaHei" w:eastAsia="Microsoft YaHei" w:hAnsi="Microsoft YaHei" w:cs="Arial" w:hint="eastAsia"/>
-                <w:sz w:val="18"/>
-                <w:szCs w:val="18"/>
-                <w:lang w:eastAsia="zh-CN"/>
-              </w:rPr>
-            </w:pPr>
-            <w:r>
-              <w:rPr>
                 <w:rFonts w:ascii="Microsoft YaHei" w:eastAsia="Microsoft YaHei" w:hAnsi="Microsoft YaHei" w:cs="Arial"/>
                 <w:sz w:val="18"/>
                 <w:szCs w:val="18"/>
                 <w:lang w:eastAsia="zh-CN"/>
               </w:rPr>
+            </w:pPr>
+            <w:r>
+              <w:rPr>
+                <w:rFonts w:ascii="Microsoft YaHei" w:eastAsia="Microsoft YaHei" w:hAnsi="Microsoft YaHei" w:cs="Arial"/>
+                <w:sz w:val="18"/>
+                <w:szCs w:val="18"/>
+                <w:lang w:eastAsia="zh-CN"/>
+              </w:rPr>
               <w:t>Letter of Consent (LOC) Application</w:t>
+            </w:r>
+            <w:r>
+              <w:rPr>
+                <w:rFonts w:ascii="Microsoft YaHei" w:eastAsia="Microsoft YaHei" w:hAnsi="Microsoft YaHei" w:cs="Arial"/>
+                <w:sz w:val="18"/>
+                <w:szCs w:val="18"/>
+                <w:lang w:eastAsia="zh-CN"/>
+              </w:rPr>
               <w:br/>
               <w:t>工作许可同意书（LOC）申请</w:t>
             </w:r>
@@ -9746,7 +9943,7 @@
           <w:p>
             <w:pPr>
               <w:rPr>
-                <w:rFonts w:ascii="Microsoft YaHei" w:eastAsia="Microsoft YaHei" w:hAnsi="Microsoft YaHei" w:cs="Arial" w:hint="eastAsia"/>
+                <w:rFonts w:ascii="Microsoft YaHei" w:eastAsia="Microsoft YaHei" w:hAnsi="Microsoft YaHei" w:cs="Arial"/>
                 <w:sz w:val="18"/>
                 <w:szCs w:val="18"/>
                 <w:lang w:eastAsia="zh-CN"/>
@@ -9994,7 +10191,34 @@
           <w:szCs w:val="20"/>
           <w:lang w:eastAsia="zh-CN"/>
         </w:rPr>
-        <w:t xml:space="preserve">   公司如若有其他变更， 价格请参考最后一页。</w:t>
+        <w:t xml:space="preserve">   </w:t>
+      </w:r>
+      <w:r>
+        <w:rPr>
+          <w:rFonts w:asciiTheme="minorHAnsi" w:eastAsia="Microsoft YaHei" w:hAnsiTheme="minorHAnsi" w:cstheme="minorHAnsi" w:hint="eastAsia"/>
+          <w:sz w:val="20"/>
+          <w:szCs w:val="20"/>
+          <w:lang w:eastAsia="zh-CN"/>
+        </w:rPr>
+        <w:t>公司如若有其他变更，</w:t>
+      </w:r>
+      <w:r>
+        <w:rPr>
+          <w:rFonts w:asciiTheme="minorHAnsi" w:eastAsia="Microsoft YaHei" w:hAnsiTheme="minorHAnsi" w:cstheme="minorHAnsi" w:hint="eastAsia"/>
+          <w:sz w:val="20"/>
+          <w:szCs w:val="20"/>
+          <w:lang w:eastAsia="zh-CN"/>
+        </w:rPr>
+        <w:t xml:space="preserve"> </w:t>
+      </w:r>
+      <w:r>
+        <w:rPr>
+          <w:rFonts w:asciiTheme="minorHAnsi" w:eastAsia="Microsoft YaHei" w:hAnsiTheme="minorHAnsi" w:cstheme="minorHAnsi" w:hint="eastAsia"/>
+          <w:sz w:val="20"/>
+          <w:szCs w:val="20"/>
+          <w:lang w:eastAsia="zh-CN"/>
+        </w:rPr>
+        <w:t>价格请参考最后一页。</w:t>
       </w:r>
     </w:p>
     <w:p>
@@ -10429,7 +10653,25 @@
           <w:szCs w:val="20"/>
           <w:lang w:val="en-SG" w:eastAsia="zh-CN"/>
         </w:rPr>
-        <w:t>我们的服务将一直有效，直到任何一方在发出两个月的通知后终止为止。 我们未到期的服务付款将退还给公司。</w:t>
+        <w:t>我们的服务将一直有效，直到任何一方在发出两个月的通知后终止为止。</w:t>
+      </w:r>
+      <w:r>
+        <w:rPr>
+          <w:rFonts w:asciiTheme="minorHAnsi" w:eastAsia="Microsoft YaHei" w:hAnsiTheme="minorHAnsi" w:cstheme="minorHAnsi"/>
+          <w:sz w:val="20"/>
+          <w:szCs w:val="20"/>
+          <w:lang w:val="en-SG" w:eastAsia="zh-CN"/>
+        </w:rPr>
+        <w:t xml:space="preserve"> </w:t>
+      </w:r>
+      <w:r>
+        <w:rPr>
+          <w:rFonts w:asciiTheme="minorHAnsi" w:eastAsia="Microsoft YaHei" w:hAnsiTheme="minorHAnsi" w:cstheme="minorHAnsi"/>
+          <w:sz w:val="20"/>
+          <w:szCs w:val="20"/>
+          <w:lang w:val="en-SG" w:eastAsia="zh-CN"/>
+        </w:rPr>
+        <w:t>我们未到期的服务付款将退还给公司。</w:t>
       </w:r>
     </w:p>
     <w:p>
@@ -10479,7 +10721,25 @@
           <w:szCs w:val="20"/>
           <w:lang w:val="en-SG" w:eastAsia="zh-CN"/>
         </w:rPr>
-        <w:t>我们的服务是在保密的基础上做出的，承诺除负责您帐户的员工或您书面指定的其他人外，不会将任何性质的信息透露给第三方。 公司及其董事同意赔偿与因履行职责所引起的任何损失，损害，成本和费用，除非是由于我们故意或不履行服务表现或不履行服务所引起的疏忽造成的。</w:t>
+        <w:t>我们的服务是在保密的基础上做出的，承诺除负责您帐户的员工或您书面指定的其他人外，不会将任何性质的信息透露给第三方。</w:t>
+      </w:r>
+      <w:r>
+        <w:rPr>
+          <w:rFonts w:asciiTheme="minorHAnsi" w:eastAsia="Microsoft YaHei" w:hAnsiTheme="minorHAnsi" w:cstheme="minorHAnsi"/>
+          <w:sz w:val="20"/>
+          <w:szCs w:val="20"/>
+          <w:lang w:val="en-SG" w:eastAsia="zh-CN"/>
+        </w:rPr>
+        <w:t xml:space="preserve"> </w:t>
+      </w:r>
+      <w:r>
+        <w:rPr>
+          <w:rFonts w:asciiTheme="minorHAnsi" w:eastAsia="Microsoft YaHei" w:hAnsiTheme="minorHAnsi" w:cstheme="minorHAnsi"/>
+          <w:sz w:val="20"/>
+          <w:szCs w:val="20"/>
+          <w:lang w:val="en-SG" w:eastAsia="zh-CN"/>
+        </w:rPr>
+        <w:t>公司及其董事同意赔偿与因履行职责所引起的任何损失，损害，成本和费用，除非是由于我们故意或不履行服务表现或不履行服务所引起的疏忽造成的。</w:t>
       </w:r>
     </w:p>
     <w:p>
@@ -10527,7 +10787,16 @@
           <w:szCs w:val="20"/>
           <w:lang w:val="en-SG" w:eastAsia="zh-CN"/>
         </w:rPr>
-        <w:t xml:space="preserve">对于因我们在执行本协议项下的服务和以下行为而引起的任何疏忽或违约或据称疏忽或违约而导致的政府机构对公司提出或提出的所有诉讼，诉讼，索赔或要求，我们应给予与之相关的费用和支出赔偿。 </w:t>
+        <w:t>对于因我们在执行本协议项下的服务和以下行为而引起的任何疏忽或违约或据称疏忽或违约而导致的政府机构对公司提出或提出的所有诉讼，诉讼，索赔或要求，我们应给予与之相关的费用和支出赔偿。</w:t>
+      </w:r>
+      <w:r>
+        <w:rPr>
+          <w:rFonts w:asciiTheme="minorHAnsi" w:eastAsia="Microsoft YaHei" w:hAnsiTheme="minorHAnsi" w:cstheme="minorHAnsi"/>
+          <w:sz w:val="20"/>
+          <w:szCs w:val="20"/>
+          <w:lang w:val="en-SG" w:eastAsia="zh-CN"/>
+        </w:rPr>
+        <w:t xml:space="preserve"> </w:t>
       </w:r>
     </w:p>
     <w:p>
@@ -10750,6 +11019,11 @@
           <w:rFonts w:asciiTheme="minorHAnsi" w:hAnsiTheme="minorHAnsi" w:cstheme="minorHAnsi"/>
         </w:rPr>
         <w:t xml:space="preserve">                 </w:t>
+      </w:r>
+      <w:r>
+        <w:rPr>
+          <w:rFonts w:asciiTheme="minorHAnsi" w:hAnsiTheme="minorHAnsi" w:cstheme="minorHAnsi"/>
+        </w:rPr>
         <w:tab/>
         <w:t xml:space="preserve">  ……………………………………………</w:t>
       </w:r>
@@ -10817,6 +11091,12 @@
           <w:b/>
         </w:rPr>
         <w:t>tor, Tassure Group</w:t>
+      </w:r>
+      <w:r>
+        <w:rPr>
+          <w:rFonts w:asciiTheme="minorHAnsi" w:hAnsiTheme="minorHAnsi" w:cstheme="minorHAnsi"/>
+          <w:b/>
+        </w:rPr>
         <w:tab/>
         <w:t xml:space="preserve">Name: </w:t>
       </w:r>
@@ -10899,7 +11179,29 @@
           <w:szCs w:val="20"/>
           <w:lang w:eastAsia="zh-CN"/>
         </w:rPr>
-        <w:t>后期维护公司如若有其他变更事项，参考可能涉及到的费用列表 （如有）</w:t>
+        <w:t>后期维护公司如若有其他变更事项，参考可能涉及到的费用列表</w:t>
+      </w:r>
+      <w:r>
+        <w:rPr>
+          <w:rFonts w:asciiTheme="minorHAnsi" w:eastAsia="Microsoft YaHei" w:hAnsiTheme="minorHAnsi" w:cstheme="minorHAnsi"/>
+          <w:b/>
+          <w:bCs/>
+          <w:sz w:val="20"/>
+          <w:szCs w:val="20"/>
+          <w:lang w:eastAsia="zh-CN"/>
+        </w:rPr>
+        <w:t xml:space="preserve"> </w:t>
+      </w:r>
+      <w:r>
+        <w:rPr>
+          <w:rFonts w:asciiTheme="minorHAnsi" w:eastAsia="Microsoft YaHei" w:hAnsiTheme="minorHAnsi" w:cstheme="minorHAnsi"/>
+          <w:b/>
+          <w:bCs/>
+          <w:sz w:val="20"/>
+          <w:szCs w:val="20"/>
+          <w:lang w:eastAsia="zh-CN"/>
+        </w:rPr>
+        <w:t>（如有）</w:t>
       </w:r>
     </w:p>
     <w:p>
@@ -15584,7 +15886,7 @@
             <w:pPr>
               <w:jc w:val="center"/>
               <w:rPr>
-                <w:rFonts w:eastAsiaTheme="minorEastAsia" w:hint="eastAsia"/>
+                <w:rFonts w:eastAsiaTheme="minorEastAsia"/>
                 <w:lang w:eastAsia="zh-CN"/>
               </w:rPr>
             </w:pPr>
@@ -16028,7 +16330,7 @@
             <w:pPr>
               <w:jc w:val="center"/>
               <w:rPr>
-                <w:rFonts w:eastAsiaTheme="minorEastAsia" w:hint="eastAsia"/>
+                <w:rFonts w:eastAsiaTheme="minorEastAsia"/>
                 <w:b/>
                 <w:bCs/>
                 <w:sz w:val="16"/>
@@ -16235,7 +16537,7 @@
             <w:pPr>
               <w:jc w:val="center"/>
               <w:rPr>
-                <w:rFonts w:eastAsiaTheme="minorEastAsia" w:hint="eastAsia"/>
+                <w:rFonts w:eastAsiaTheme="minorEastAsia"/>
                 <w:color w:val="4A4A4A"/>
                 <w:sz w:val="18"/>
                 <w:szCs w:val="18"/>
@@ -16431,7 +16733,7 @@
             <w:pPr>
               <w:jc w:val="center"/>
               <w:rPr>
-                <w:rFonts w:eastAsiaTheme="minorEastAsia" w:hint="eastAsia"/>
+                <w:rFonts w:eastAsiaTheme="minorEastAsia"/>
                 <w:color w:val="4A4A4A"/>
                 <w:sz w:val="18"/>
                 <w:szCs w:val="18"/>
@@ -16477,7 +16779,7 @@
             <w:pPr>
               <w:jc w:val="center"/>
               <w:rPr>
-                <w:rFonts w:eastAsiaTheme="minorEastAsia" w:hint="eastAsia"/>
+                <w:rFonts w:eastAsiaTheme="minorEastAsia"/>
                 <w:b/>
                 <w:bCs/>
                 <w:sz w:val="16"/>
@@ -16694,7 +16996,7 @@
             <w:pPr>
               <w:jc w:val="center"/>
               <w:rPr>
-                <w:rFonts w:eastAsiaTheme="minorEastAsia" w:hint="eastAsia"/>
+                <w:rFonts w:eastAsiaTheme="minorEastAsia"/>
                 <w:color w:val="4A4A4A"/>
                 <w:sz w:val="18"/>
                 <w:szCs w:val="18"/>
@@ -16741,7 +17043,7 @@
             <w:pPr>
               <w:jc w:val="center"/>
               <w:rPr>
-                <w:rFonts w:eastAsiaTheme="minorEastAsia" w:hint="eastAsia"/>
+                <w:rFonts w:eastAsiaTheme="minorEastAsia"/>
                 <w:b/>
                 <w:bCs/>
                 <w:sz w:val="16"/>
@@ -16803,7 +17105,7 @@
           <w:p>
             <w:pPr>
               <w:rPr>
-                <w:rFonts w:eastAsia="Arial" w:hint="eastAsia"/>
+                <w:rFonts w:eastAsia="Arial"/>
                 <w:color w:val="4A4A4A"/>
                 <w:sz w:val="16"/>
                 <w:szCs w:val="16"/>
@@ -16861,21 +17163,24 @@
           <w:p>
             <w:pPr>
               <w:rPr>
-                <w:rFonts w:eastAsia="Arial"/>
+                <w:rFonts w:eastAsiaTheme="minorEastAsia"/>
+                <w:color w:val="4A4A4A"/>
+                <w:sz w:val="18"/>
+                <w:szCs w:val="18"/>
+                <w:lang w:eastAsia="zh-CN"/>
+              </w:rPr>
+            </w:pPr>
+            <w:proofErr w:type="spellStart"/>
+            <w:r>
+              <w:rPr>
+                <w:rFonts w:ascii="Microsoft YaHei" w:eastAsia="Microsoft YaHei" w:hAnsi="Microsoft YaHei" w:cs="Microsoft YaHei" w:hint="eastAsia"/>
                 <w:color w:val="4A4A4A"/>
                 <w:sz w:val="16"/>
                 <w:szCs w:val="16"/>
               </w:rPr>
-            </w:pPr>
-            <w:r>
-              <w:rPr>
-                <w:rFonts w:ascii="Microsoft YaHei" w:eastAsia="Microsoft YaHei" w:hAnsi="Microsoft YaHei" w:cs="Microsoft YaHei" w:hint="eastAsia"/>
-                <w:color w:val="4A4A4A"/>
-                <w:sz w:val="16"/>
-                <w:szCs w:val="16"/>
-              </w:rPr>
               <w:t>文件见证签字</w:t>
             </w:r>
+            <w:proofErr w:type="spellEnd"/>
           </w:p>
         </w:tc>
         <w:tc>
@@ -16959,7 +17264,7 @@
             <w:pPr>
               <w:jc w:val="center"/>
               <w:rPr>
-                <w:rFonts w:eastAsiaTheme="minorEastAsia" w:hint="eastAsia"/>
+                <w:rFonts w:eastAsiaTheme="minorEastAsia"/>
                 <w:color w:val="4A4A4A"/>
                 <w:sz w:val="18"/>
                 <w:szCs w:val="18"/>
@@ -17178,7 +17483,7 @@
             <w:pPr>
               <w:jc w:val="center"/>
               <w:rPr>
-                <w:rFonts w:eastAsiaTheme="minorEastAsia" w:hint="eastAsia"/>
+                <w:rFonts w:eastAsiaTheme="minorEastAsia"/>
                 <w:color w:val="4A4A4A"/>
                 <w:sz w:val="18"/>
                 <w:szCs w:val="18"/>
@@ -17273,7 +17578,7 @@
           <w:p>
             <w:pPr>
               <w:rPr>
-                <w:rFonts w:eastAsiaTheme="minorEastAsia" w:hint="eastAsia"/>
+                <w:rFonts w:eastAsiaTheme="minorEastAsia"/>
                 <w:color w:val="4A4A4A"/>
                 <w:sz w:val="16"/>
                 <w:szCs w:val="16"/>
@@ -17361,7 +17666,7 @@
             <w:pPr>
               <w:jc w:val="center"/>
               <w:rPr>
-                <w:rFonts w:eastAsiaTheme="minorEastAsia" w:hint="eastAsia"/>
+                <w:rFonts w:eastAsiaTheme="minorEastAsia"/>
                 <w:color w:val="4A4A4A"/>
                 <w:sz w:val="18"/>
                 <w:szCs w:val="18"/>
@@ -17480,6 +17785,7 @@
                 <w:color w:val="4A4A4A"/>
                 <w:sz w:val="16"/>
                 <w:szCs w:val="16"/>
+                <w:lang w:eastAsia="zh-CN"/>
               </w:rPr>
             </w:pPr>
             <w:r>
@@ -17488,6 +17794,7 @@
                 <w:color w:val="4A4A4A"/>
                 <w:sz w:val="16"/>
                 <w:szCs w:val="16"/>
+                <w:lang w:eastAsia="zh-CN"/>
               </w:rPr>
               <w:t>KYC/</w:t>
             </w:r>
@@ -17497,6 +17804,7 @@
                 <w:color w:val="4A4A4A"/>
                 <w:sz w:val="16"/>
                 <w:szCs w:val="16"/>
+                <w:lang w:eastAsia="zh-CN"/>
               </w:rPr>
               <w:t>尽职调查</w:t>
             </w:r>
@@ -17506,6 +17814,7 @@
                 <w:color w:val="4A4A4A"/>
                 <w:sz w:val="16"/>
                 <w:szCs w:val="16"/>
+                <w:lang w:eastAsia="zh-CN"/>
               </w:rPr>
               <w:t>/CDD/</w:t>
             </w:r>
@@ -17515,6 +17824,7 @@
                 <w:color w:val="4A4A4A"/>
                 <w:sz w:val="16"/>
                 <w:szCs w:val="16"/>
+                <w:lang w:eastAsia="zh-CN"/>
               </w:rPr>
               <w:t>背景</w:t>
             </w:r>
@@ -17524,6 +17834,7 @@
                 <w:color w:val="4A4A4A"/>
                 <w:sz w:val="16"/>
                 <w:szCs w:val="16"/>
+                <w:lang w:eastAsia="zh-CN"/>
               </w:rPr>
               <w:t>/</w:t>
             </w:r>
@@ -17533,6 +17844,7 @@
                 <w:color w:val="4A4A4A"/>
                 <w:sz w:val="16"/>
                 <w:szCs w:val="16"/>
+                <w:lang w:eastAsia="zh-CN"/>
               </w:rPr>
               <w:t>合规性检查</w:t>
             </w:r>
@@ -17620,7 +17932,7 @@
             <w:pPr>
               <w:jc w:val="center"/>
               <w:rPr>
-                <w:rFonts w:eastAsiaTheme="minorEastAsia" w:hint="eastAsia"/>
+                <w:rFonts w:eastAsiaTheme="minorEastAsia"/>
                 <w:color w:val="4A4A4A"/>
                 <w:sz w:val="18"/>
                 <w:szCs w:val="18"/>
@@ -18414,7 +18726,7 @@
         <v:path o:extrusionok="f" gradientshapeok="t" o:connecttype="rect"/>
         <o:lock v:ext="edit" aspectratio="t"/>
       </v:shapetype>
-      <v:shape id="_x0000_i1142" type="#_x0000_t75" style="width:11.4pt;height:11.4pt;visibility:visible;mso-wrap-style:square" o:bullet="t">
+      <v:shape id="_x0000_i1167" type="#_x0000_t75" style="width:11.4pt;height:11.4pt;visibility:visible;mso-wrap-style:square" o:bullet="t">
         <v:imagedata r:id="rId1" o:title=""/>
       </v:shape>
     </w:pict>
@@ -21966,6 +22278,7 @@
   <w:style w:type="character" w:default="1" w:styleId="DefaultParagraphFont">
     <w:name w:val="Default Paragraph Font"/>
     <w:uiPriority w:val="1"/>
+    <w:semiHidden/>
     <w:unhideWhenUsed/>
   </w:style>
   <w:style w:type="table" w:default="1" w:styleId="TableNormal">

</xml_diff>